<commit_message>
yau 0.3.1: master acknowledgements+AI template with per-subject guidance; word-count attribution corrected
Co-Authored-By: Claude Fable 5 <noreply@anthropic.com>
</commit_message>
<xml_diff>
--- a/plugins/yau/skills/yau-submission-reviewer/assets/templates/yau-report-template.docx
+++ b/plugins/yau/skills/yau-submission-reviewer/assets/templates/yau-report-template.docx
@@ -668,7 +668,7 @@
         <w:ind w:firstLine="0"/>
       </w:pPr>
       <w:r>
-        <w:t>〔依据：page-rule.html 致谢页条款——1–2 页、500–1500 字（官方模板旧写 500–1000，以规则页为准），四项内容缺一不可。完整写法示例见同目录《致谢页范例》。〕</w:t>
+        <w:t>〔依据：page-rule.html 致谢页条款。字数口径：规则页"1-2 页 word 文档（500-1500 字）"指其中的 AI 使用说明部分（紧随 AI 段之后）；致谢页整体无字数上限（官方模板旧写 500–1000，以规则页为准）。必备内容缺一不可。完整骨架见同目录《致谢页模板》，填写完成示范见《致谢页范例》。〕</w:t>
       </w:r>
     </w:p>
     <w:p>
@@ -684,7 +684,15 @@
         <w:pStyle w:val="占位说明"/>
       </w:pPr>
       <w:r>
-        <w:t>〈① 整体研究过程逐环节分工：选题来源、数据获取、分析数据及计算、实验设计及实施、撰写论文——逐人具体到环节，并说明遇到的困难及解决经过。〉</w:t>
+        <w:t>〈① 整体研究过程逐环节分工：选题来源、数据获取、分析数据及计算、实验设计及实施、撰写论文——逐人具体到环节。〉</w:t>
+      </w:r>
+    </w:p>
+    <w:p>
+      <w:pPr>
+        <w:pStyle w:val="占位说明"/>
+      </w:pPr>
+      <w:r>
+        <w:t>〈①′ 不同环节遇到的困难及解决问题的经过（官方要求要素，不可省略）：按环节写 2–4 个真实困难——卡在哪里、怎么解决、结果如何。写具体经过，不写"经过努力克服了困难"式套话。〉</w:t>
       </w:r>
     </w:p>
     <w:p>
@@ -708,7 +716,7 @@
         <w:pStyle w:val="占位说明"/>
       </w:pPr>
       <w:r>
-        <w:t>〈④ AI 使用披露（show-86-59.html，2026-07-08）：工具名称及版本、具体使用环节及用途、使用时间及频率；使用须事先获指导教师许可，聊天记录上传报名系统“其他材料”栏。未使用 AI 也写明“未使用”。〉</w:t>
+        <w:t>〈④ AI 使用披露（show-86-59.html，2026-07-08）：工具名称及版本、具体使用环节及用途、使用时间及频率；使用须事先获指导教师许可，聊天记录上传报名系统“其他材料”栏。未使用 AI 也写明“未使用”。〉 本部分（AI 使用说明）按规则页控制在 1–2 页 word 文档（500–1500 字）。</w:t>
       </w:r>
     </w:p>
     <w:p>

</xml_diff>